<commit_message>
Notification bell checks every 5 seconds and when the tab is focused; guide updated
Co-Authored-By: Claude Sonnet 5.5 <noreply@anthropic.com>
</commit_message>
<xml_diff>
--- a/docs/REIMSYS User Guide.docx
+++ b/docs/REIMSYS User Guide.docx
@@ -2009,7 +2009,7 @@
         <w:t xml:space="preserve">bell</w:t>
       </w:r>
       <w:r>
-        <w:t xml:space="preserve"> shows what happened. It updates by itself about every 20 seconds, so you do not need to refresh. Tap one to open that receipt.</w:t>
+        <w:t xml:space="preserve"> shows what happened. It updates by itself within a few seconds, so you do not need to refresh. Tap one to open that receipt.</w:t>
       </w:r>
     </w:p>
     <w:p>
@@ -5628,7 +5628,7 @@
           </w:tcPr>
           <w:p>
             <w:r>
-              <w:t xml:space="preserve">Wait up to 20 seconds, or reload the page. If it still shows nothing, tell your administrator.</w:t>
+              <w:t xml:space="preserve">Wait a few seconds, or reload the page. If it still shows nothing, tell your administrator.</w:t>
             </w:r>
           </w:p>
         </w:tc>

</xml_diff>

<commit_message>
Dashboard queue two-line layout is more compact; bell polling back to 20s (live push already covers it); tax dashboard test follows the new tile order; guide describes the Live light
Co-Authored-By: Claude Sonnet 5.5 <noreply@anthropic.com>
</commit_message>
<xml_diff>
--- a/docs/REIMSYS User Guide.docx
+++ b/docs/REIMSYS User Guide.docx
@@ -2009,7 +2009,17 @@
         <w:t xml:space="preserve">bell</w:t>
       </w:r>
       <w:r>
-        <w:t xml:space="preserve"> shows what happened. It updates by itself within a few seconds, so you do not need to refresh. Tap one to open that receipt.</w:t>
+        <w:t xml:space="preserve"> shows what happened. It updates by itself, and the small </w:t>
+      </w:r>
+      <w:r>
+        <w:rPr>
+          <w:b/>
+          <w:bCs/>
+        </w:rPr>
+        <w:t xml:space="preserve">Live</w:t>
+      </w:r>
+      <w:r>
+        <w:t xml:space="preserve"> light beside it shows the connection is working, so you do not need to refresh. Tap one to open that receipt.</w:t>
       </w:r>
     </w:p>
     <w:p>
@@ -5628,7 +5638,7 @@
           </w:tcPr>
           <w:p>
             <w:r>
-              <w:t xml:space="preserve">Wait a few seconds, or reload the page. If it still shows nothing, tell your administrator.</w:t>
+              <w:t xml:space="preserve">If the light beside the bell says Offline or Reconnecting, check your internet connection, wait a moment (it checks again within 20 seconds), or reload the page. If it still shows nothing, tell your administrator.</w:t>
             </w:r>
           </w:p>
         </w:tc>

</xml_diff>